<commit_message>
Falta de ajuste das médias: modelos com efeito aleatório por condição concordam com os beta-binomiais
Co-Authored-By: Claude Opus 5.5 <noreply@anthropic.com>
</commit_message>
<xml_diff>
--- a/manuscript/supporting_information.docx
+++ b/manuscript/supporting_information.docx
@@ -1001,7 +1001,7 @@
     </w:p>
     <w:bookmarkEnd w:id="26"/>
     <w:bookmarkEnd w:id="27"/>
-    <w:bookmarkStart w:id="40" w:name="appendix-s2.-extended-results"/>
+    <w:bookmarkStart w:id="41" w:name="appendix-s2.-extended-results"/>
     <w:p>
       <w:pPr>
         <w:pStyle w:val="Heading1"/>
@@ -1213,12 +1213,42 @@
       </w:r>
     </w:p>
     <w:bookmarkEnd w:id="36"/>
-    <w:bookmarkStart w:id="37" w:name="type-i-error-in-layer-b"/>
+    <w:bookmarkStart w:id="37" w:name="lack-of-fit-of-the-mean-structure"/>
     <w:p>
       <w:pPr>
         <w:pStyle w:val="Heading2"/>
       </w:pPr>
       <w:r>
+        <w:t xml:space="preserve">Lack of fit of the mean structure</w:t>
+      </w:r>
+    </w:p>
+    <w:p>
+      <w:pPr>
+        <w:pStyle w:val="FirstParagraph"/>
+      </w:pPr>
+      <w:r>
+        <w:t xml:space="preserve">Each aggregated row is one condition, so the data hold no information on variation among replicates beyond the binomial, and the extra-binomial dispersion of the quasibinomial models (Pearson χ² / df = 2.1–8.5; P &lt; 10</w:t>
+      </w:r>
+      <w:r>
+        <w:rPr>
+          <w:vertAlign w:val="superscript"/>
+        </w:rPr>
+        <w:t xml:space="preserve">−88</w:t>
+      </w:r>
+      <w:r>
+        <w:t xml:space="preserve"> </w:t>
+      </w:r>
+      <w:r>
+        <w:t xml:space="preserve">in every model; file mean_structure.csv) measures the lack of fit of the fixed structure, which the beta-binomial precision φ absorbs. To check whether this lack of fit biases the predicted rates, we refitted every model with a binomial likelihood, the same fixed structure and a random intercept per condition, which captures any departure of a condition from the fixed structure (prior exponential(2) on its standard deviation; four chains of 2,000 iterations; script 35_mean_structure.R). The standard deviation of the condition effects was 0.16–0.28 on the logit scale. The predicted rates of these models agreed with those of the beta-binomial models (median absolute difference 0.002–0.014 across models, maximum 0.025–0.117, correlation 0.972–0.999). Convergence was acceptable but weaker than in the main models (R̂ ≤ 1.02, bulk effective sample size ≥ 377), and 13% of the transitions of the Layer A power model reached the maximum tree depth, so we used these models only as a check.</w:t>
+      </w:r>
+    </w:p>
+    <w:bookmarkEnd w:id="37"/>
+    <w:bookmarkStart w:id="38" w:name="type-i-error-in-layer-b"/>
+    <w:p>
+      <w:pPr>
+        <w:pStyle w:val="Heading2"/>
+      </w:pPr>
+      <w:r>
         <w:t xml:space="preserve">Type I error in Layer B</w:t>
       </w:r>
     </w:p>
@@ -1230,8 +1260,8 @@
         <w:t xml:space="preserve">Under the null hypothesis, no lower CI bound exceeded 0.075 at N = 100 (largest posterior median 0.088). However, raw rejection rates exceeded that limit for GLM PCPS2 in S2σ under species sorting (0.094 at N = 100 and 0.104–0.129 at N = 200 in the low- and mid-γ cells) and for the PCC in S2h (0.085–0.089 at N = 100; 0.111 under species sorting and 0.116–0.143 under mass effects at N = 200).</w:t>
       </w:r>
     </w:p>
-    <w:bookmarkEnd w:id="37"/>
-    <w:bookmarkStart w:id="38" w:name="clade-recovery-with-abundance-data"/>
+    <w:bookmarkEnd w:id="38"/>
+    <w:bookmarkStart w:id="39" w:name="clade-recovery-with-abundance-data"/>
     <w:p>
       <w:pPr>
         <w:pStyle w:val="Heading2"/>
@@ -1248,8 +1278,8 @@
         <w:t xml:space="preserve">With abundance data, recovery was lower for the compositional phylofactorization (0.68 and 0.56 for basal and recent clades at N = 100) than for evoPCA (0.78 and 0.65), and PCPS gained 0.29 (95% CI 0.25–0.33) and 0.23 (0.21–0.25) with low γ.</w:t>
       </w:r>
     </w:p>
-    <w:bookmarkEnd w:id="38"/>
-    <w:bookmarkStart w:id="39" w:name="convergence-and-fit-of-the-formal-models"/>
+    <w:bookmarkEnd w:id="39"/>
+    <w:bookmarkStart w:id="40" w:name="convergence-and-fit-of-the-formal-models"/>
     <w:p>
       <w:pPr>
         <w:pStyle w:val="Heading2"/>
@@ -1287,9 +1317,9 @@
         <w:t xml:space="preserve">≤ 1.01, bulk effective sample size ≥ 908 and tail effective sample size ≥ 1,477, no divergent transitions and no transition at the maximum tree depth (Table S3). The in-sample 95% posterior predictive intervals contained 96–98% of the observed rates of each condition and the 50% intervals 61–70%, so the predictive intervals are slightly wider than needed; when we summed the conditions of each test, N and cell, every group fell within its 95% interval.</w:t>
       </w:r>
     </w:p>
-    <w:bookmarkEnd w:id="39"/>
     <w:bookmarkEnd w:id="40"/>
-    <w:bookmarkStart w:id="46" w:name="Xe229b3875b755fa040ccee6a6defa38ba6f6b70"/>
+    <w:bookmarkEnd w:id="41"/>
+    <w:bookmarkStart w:id="47" w:name="Xe229b3875b755fa040ccee6a6defa38ba6f6b70"/>
     <w:p>
       <w:pPr>
         <w:pStyle w:val="Heading1"/>
@@ -1298,7 +1328,7 @@
         <w:t xml:space="preserve">Appendix S3. Real pools and real metacommunities</w:t>
       </w:r>
     </w:p>
-    <w:bookmarkStart w:id="41" w:name="methods"/>
+    <w:bookmarkStart w:id="42" w:name="methods"/>
     <w:p>
       <w:pPr>
         <w:pStyle w:val="Heading2"/>
@@ -1315,8 +1345,8 @@
         <w:t xml:space="preserve">To show where real regional species pools fall in the grid of tree shapes, and how the methods behave with real data, we used 14 tadpole metacommunities compiled from the literature and from unpublished data. We harmonized species names with the Amphibian Species of the World (Frost, 2026; through the internal dataset of AmphiNom, updated on 16 October 2025) using the R package AmphiNom v. 1.1.0 (Liedtke, 2019), excluded undetermined taxa, and matched the remaining 123 species to the tips of the Portik et al. (2023) tree. We built three nested pools (Atlantic Forest; Atlantic Forest and interior of São Paulo; all South American metacommunities) pruned the tree to each, and computed γ and the normalized Colless index on the point-estimate tree and on its 100 time-calibrated bootstrap trees. For the case study, we used the metacommunities with at least 10 ponds and pond depth measured in every pond, namely two of the 14 and one additional published dataset: Serra da Bocaina (13 ponds; Provete et al., 2014), southern Brazil (32 ponds; Both et al., 2011) and northwestern São Paulo (40 ponds; Prado &amp; Rossa-Feres, 2014). We applied all tests and the four clade-scoring methods to incidence data with pond depth as the gradient, and also with canopy cover in Bocaina, the variable associated with its phylogenetic composition in a previous analysis with PCPS (Provete, 2018).</w:t>
       </w:r>
     </w:p>
-    <w:bookmarkEnd w:id="41"/>
-    <w:bookmarkStart w:id="45" w:name="results"/>
+    <w:bookmarkEnd w:id="42"/>
+    <w:bookmarkStart w:id="46" w:name="results"/>
     <w:p>
       <w:pPr>
         <w:pStyle w:val="Heading2"/>
@@ -1350,18 +1380,18 @@
           <wp:inline>
             <wp:extent cx="4890135" cy="3261010"/>
             <wp:effectExtent b="0" l="0" r="0" t="0"/>
-            <wp:docPr descr="" title="" id="43" name="Picture"/>
+            <wp:docPr descr="" title="" id="44" name="Picture"/>
             <a:graphic>
               <a:graphicData uri="http://schemas.openxmlformats.org/drawingml/2006/picture">
                 <pic:pic>
                   <pic:nvPicPr>
-                    <pic:cNvPr descr="figures/box1_pools.png" id="44" name="Picture"/>
+                    <pic:cNvPr descr="figures/box1_pools.png" id="45" name="Picture"/>
                     <pic:cNvPicPr>
                       <a:picLocks noChangeArrowheads="1" noChangeAspect="1"/>
                     </pic:cNvPicPr>
                   </pic:nvPicPr>
                   <pic:blipFill>
-                    <a:blip r:embed="rId42"/>
+                    <a:blip r:embed="rId43"/>
                     <a:stretch>
                       <a:fillRect/>
                     </a:stretch>
@@ -1396,9 +1426,9 @@
         <w:t xml:space="preserve">Fig. S1. Tree shape of three nested regional pools of anurans (filled points and bars, median and 2.5–97.5% quantiles across 100 bootstrap trees; open diamonds, point-estimate tree) against the targets of the simulation grid (open symbols, by N) and the anuran clades with 40–250 tips of Portik et al. (2023) (grey points). Notice that the pools fall inside the grid and close to its Yule and median levels, and that the point-estimate tree has a lower γ than most bootstrap trees.</w:t>
       </w:r>
     </w:p>
-    <w:bookmarkEnd w:id="45"/>
     <w:bookmarkEnd w:id="46"/>
-    <w:bookmarkStart w:id="48" w:name="table-s1"/>
+    <w:bookmarkEnd w:id="47"/>
+    <w:bookmarkStart w:id="49" w:name="table-s1"/>
     <w:p>
       <w:pPr>
         <w:pStyle w:val="Heading1"/>
@@ -1442,7 +1472,7 @@
       <w:tr>
         <w:tc>
           <w:tcPr/>
-          <w:bookmarkStart w:id="47" w:name="tbl-s1"/>
+          <w:bookmarkStart w:id="48" w:name="tbl-s1"/>
           <w:p>
             <w:pPr>
               <w:jc w:val="center"/>
@@ -4445,13 +4475,13 @@
               </w:tc>
             </w:tr>
           </w:tbl>
-          <w:bookmarkEnd w:id="47"/>
+          <w:bookmarkEnd w:id="48"/>
           <w:p/>
         </w:tc>
       </w:tr>
     </w:tbl>
-    <w:bookmarkEnd w:id="48"/>
-    <w:bookmarkStart w:id="50" w:name="table-s2"/>
+    <w:bookmarkEnd w:id="49"/>
+    <w:bookmarkStart w:id="51" w:name="table-s2"/>
     <w:p>
       <w:pPr>
         <w:pStyle w:val="Heading1"/>
@@ -4579,7 +4609,7 @@
       <w:tr>
         <w:tc>
           <w:tcPr/>
-          <w:bookmarkStart w:id="49" w:name="tbl-s2"/>
+          <w:bookmarkStart w:id="50" w:name="tbl-s2"/>
           <w:p>
             <w:pPr>
               <w:jc w:val="center"/>
@@ -5092,13 +5122,13 @@
               </w:tc>
             </w:tr>
           </w:tbl>
-          <w:bookmarkEnd w:id="49"/>
+          <w:bookmarkEnd w:id="50"/>
           <w:p/>
         </w:tc>
       </w:tr>
     </w:tbl>
-    <w:bookmarkEnd w:id="50"/>
-    <w:bookmarkStart w:id="52" w:name="table-s3"/>
+    <w:bookmarkEnd w:id="51"/>
+    <w:bookmarkStart w:id="53" w:name="table-s3"/>
     <w:p>
       <w:pPr>
         <w:pStyle w:val="Heading1"/>
@@ -5146,7 +5176,7 @@
       <w:tr>
         <w:tc>
           <w:tcPr/>
-          <w:bookmarkStart w:id="51" w:name="tbl-s3"/>
+          <w:bookmarkStart w:id="52" w:name="tbl-s3"/>
           <w:p>
             <w:pPr>
               <w:jc w:val="center"/>
@@ -6054,13 +6084,13 @@
               </w:tc>
             </w:tr>
           </w:tbl>
-          <w:bookmarkEnd w:id="51"/>
+          <w:bookmarkEnd w:id="52"/>
           <w:p/>
         </w:tc>
       </w:tr>
     </w:tbl>
-    <w:bookmarkEnd w:id="52"/>
-    <w:bookmarkStart w:id="53" w:name="references"/>
+    <w:bookmarkEnd w:id="53"/>
+    <w:bookmarkStart w:id="54" w:name="references"/>
     <w:p>
       <w:pPr>
         <w:pStyle w:val="Heading1"/>
@@ -6432,7 +6462,7 @@
         <w:t xml:space="preserve">, 5, e2969. https://doi.org/10.7717/peerj.2969</w:t>
       </w:r>
     </w:p>
-    <w:bookmarkEnd w:id="53"/>
+    <w:bookmarkEnd w:id="54"/>
     <w:sectPr>
       <w:footerReference r:id="rId9" w:type="default"/>
       <w:footnotePr>

</xml_diff>

<commit_message>
SI renderizado com a Tabela S3 atualizada
Co-Authored-By: Claude Opus 5.5 <noreply@anthropic.com>
</commit_message>
<xml_diff>
--- a/manuscript/supporting_information.docx
+++ b/manuscript/supporting_information.docx
@@ -5198,17 +5198,17 @@
               <w:tblLook w:firstRow="1" w:lastRow="0" w:firstColumn="0" w:lastColumn="0" w:noHBand="0" w:noVBand="0" w:val="0020"/>
             </w:tblPr>
             <w:tblGrid>
-              <w:gridCol w:w="484"/>
-              <w:gridCol w:w="592"/>
-              <w:gridCol w:w="754"/>
-              <w:gridCol w:w="754"/>
-              <w:gridCol w:w="646"/>
-              <w:gridCol w:w="862"/>
-              <w:gridCol w:w="538"/>
-              <w:gridCol w:w="538"/>
-              <w:gridCol w:w="1077"/>
-              <w:gridCol w:w="1077"/>
-              <w:gridCol w:w="592"/>
+              <w:gridCol w:w="633"/>
+              <w:gridCol w:w="580"/>
+              <w:gridCol w:w="739"/>
+              <w:gridCol w:w="739"/>
+              <w:gridCol w:w="633"/>
+              <w:gridCol w:w="844"/>
+              <w:gridCol w:w="528"/>
+              <w:gridCol w:w="528"/>
+              <w:gridCol w:w="1056"/>
+              <w:gridCol w:w="1056"/>
+              <w:gridCol w:w="580"/>
             </w:tblGrid>
             <w:tr>
               <w:trPr>
@@ -6079,6 +6079,296 @@
                   </w:pPr>
                   <w:r>
                     <w:t xml:space="preserve">4.198</w:t>
+                  </w:r>
+                </w:p>
+              </w:tc>
+            </w:tr>
+            <w:tr>
+              <w:tc>
+                <w:tcPr/>
+                <w:p>
+                  <w:pPr>
+                    <w:pStyle w:val="Compact"/>
+                    <w:jc w:val="left"/>
+                    <w:jc w:val="center"/>
+                  </w:pPr>
+                  <w:r>
+                    <w:t xml:space="preserve">type_I_axes</w:t>
+                  </w:r>
+                </w:p>
+              </w:tc>
+              <w:tc>
+                <w:tcPr/>
+                <w:p>
+                  <w:pPr>
+                    <w:pStyle w:val="Compact"/>
+                    <w:jc w:val="right"/>
+                    <w:jc w:val="center"/>
+                  </w:pPr>
+                  <w:r>
+                    <w:t xml:space="preserve">1.005</w:t>
+                  </w:r>
+                </w:p>
+              </w:tc>
+              <w:tc>
+                <w:tcPr/>
+                <w:p>
+                  <w:pPr>
+                    <w:pStyle w:val="Compact"/>
+                    <w:jc w:val="right"/>
+                    <w:jc w:val="center"/>
+                  </w:pPr>
+                  <w:r>
+                    <w:t xml:space="preserve">749.084</w:t>
+                  </w:r>
+                </w:p>
+              </w:tc>
+              <w:tc>
+                <w:tcPr/>
+                <w:p>
+                  <w:pPr>
+                    <w:pStyle w:val="Compact"/>
+                    <w:jc w:val="right"/>
+                    <w:jc w:val="center"/>
+                  </w:pPr>
+                  <w:r>
+                    <w:t xml:space="preserve">1451.114</w:t>
+                  </w:r>
+                </w:p>
+              </w:tc>
+              <w:tc>
+                <w:tcPr/>
+                <w:p>
+                  <w:pPr>
+                    <w:pStyle w:val="Compact"/>
+                    <w:jc w:val="right"/>
+                    <w:jc w:val="center"/>
+                  </w:pPr>
+                  <w:r>
+                    <w:t xml:space="preserve">0</w:t>
+                  </w:r>
+                </w:p>
+              </w:tc>
+              <w:tc>
+                <w:tcPr/>
+                <w:p>
+                  <w:pPr>
+                    <w:pStyle w:val="Compact"/>
+                    <w:jc w:val="right"/>
+                    <w:jc w:val="center"/>
+                  </w:pPr>
+                  <w:r>
+                    <w:t xml:space="preserve">0</w:t>
+                  </w:r>
+                </w:p>
+              </w:tc>
+              <w:tc>
+                <w:tcPr/>
+                <w:p>
+                  <w:pPr>
+                    <w:pStyle w:val="Compact"/>
+                    <w:jc w:val="right"/>
+                    <w:jc w:val="center"/>
+                  </w:pPr>
+                  <w:r>
+                    <w:t xml:space="preserve">0.685</w:t>
+                  </w:r>
+                </w:p>
+              </w:tc>
+              <w:tc>
+                <w:tcPr/>
+                <w:p>
+                  <w:pPr>
+                    <w:pStyle w:val="Compact"/>
+                    <w:jc w:val="right"/>
+                    <w:jc w:val="center"/>
+                  </w:pPr>
+                  <w:r>
+                    <w:t xml:space="preserve">0.988</w:t>
+                  </w:r>
+                </w:p>
+              </w:tc>
+              <w:tc>
+                <w:tcPr/>
+                <w:p>
+                  <w:pPr>
+                    <w:pStyle w:val="Compact"/>
+                    <w:jc w:val="right"/>
+                    <w:jc w:val="center"/>
+                  </w:pPr>
+                  <w:r>
+                    <w:t xml:space="preserve">0.974</w:t>
+                  </w:r>
+                </w:p>
+              </w:tc>
+              <w:tc>
+                <w:tcPr/>
+                <w:p>
+                  <w:pPr>
+                    <w:pStyle w:val="Compact"/>
+                    <w:jc w:val="right"/>
+                    <w:jc w:val="center"/>
+                  </w:pPr>
+                  <w:r>
+                    <w:t xml:space="preserve">1</w:t>
+                  </w:r>
+                </w:p>
+              </w:tc>
+              <w:tc>
+                <w:tcPr/>
+                <w:p>
+                  <w:pPr>
+                    <w:pStyle w:val="Compact"/>
+                    <w:jc w:val="right"/>
+                    <w:jc w:val="center"/>
+                  </w:pPr>
+                  <w:r>
+                    <w:t xml:space="preserve">1.452</w:t>
+                  </w:r>
+                </w:p>
+              </w:tc>
+            </w:tr>
+            <w:tr>
+              <w:tc>
+                <w:tcPr/>
+                <w:p>
+                  <w:pPr>
+                    <w:pStyle w:val="Compact"/>
+                    <w:jc w:val="left"/>
+                    <w:jc w:val="center"/>
+                  </w:pPr>
+                  <w:r>
+                    <w:t xml:space="preserve">power_axes</w:t>
+                  </w:r>
+                </w:p>
+              </w:tc>
+              <w:tc>
+                <w:tcPr/>
+                <w:p>
+                  <w:pPr>
+                    <w:pStyle w:val="Compact"/>
+                    <w:jc w:val="right"/>
+                    <w:jc w:val="center"/>
+                  </w:pPr>
+                  <w:r>
+                    <w:t xml:space="preserve">1.005</w:t>
+                  </w:r>
+                </w:p>
+              </w:tc>
+              <w:tc>
+                <w:tcPr/>
+                <w:p>
+                  <w:pPr>
+                    <w:pStyle w:val="Compact"/>
+                    <w:jc w:val="right"/>
+                    <w:jc w:val="center"/>
+                  </w:pPr>
+                  <w:r>
+                    <w:t xml:space="preserve">748.550</w:t>
+                  </w:r>
+                </w:p>
+              </w:tc>
+              <w:tc>
+                <w:tcPr/>
+                <w:p>
+                  <w:pPr>
+                    <w:pStyle w:val="Compact"/>
+                    <w:jc w:val="right"/>
+                    <w:jc w:val="center"/>
+                  </w:pPr>
+                  <w:r>
+                    <w:t xml:space="preserve">1489.957</w:t>
+                  </w:r>
+                </w:p>
+              </w:tc>
+              <w:tc>
+                <w:tcPr/>
+                <w:p>
+                  <w:pPr>
+                    <w:pStyle w:val="Compact"/>
+                    <w:jc w:val="right"/>
+                    <w:jc w:val="center"/>
+                  </w:pPr>
+                  <w:r>
+                    <w:t xml:space="preserve">0</w:t>
+                  </w:r>
+                </w:p>
+              </w:tc>
+              <w:tc>
+                <w:tcPr/>
+                <w:p>
+                  <w:pPr>
+                    <w:pStyle w:val="Compact"/>
+                    <w:jc w:val="right"/>
+                    <w:jc w:val="center"/>
+                  </w:pPr>
+                  <w:r>
+                    <w:t xml:space="preserve">0</w:t>
+                  </w:r>
+                </w:p>
+              </w:tc>
+              <w:tc>
+                <w:tcPr/>
+                <w:p>
+                  <w:pPr>
+                    <w:pStyle w:val="Compact"/>
+                    <w:jc w:val="right"/>
+                    <w:jc w:val="center"/>
+                  </w:pPr>
+                  <w:r>
+                    <w:t xml:space="preserve">0.704</w:t>
+                  </w:r>
+                </w:p>
+              </w:tc>
+              <w:tc>
+                <w:tcPr/>
+                <w:p>
+                  <w:pPr>
+                    <w:pStyle w:val="Compact"/>
+                    <w:jc w:val="right"/>
+                    <w:jc w:val="center"/>
+                  </w:pPr>
+                  <w:r>
+                    <w:t xml:space="preserve">0.967</w:t>
+                  </w:r>
+                </w:p>
+              </w:tc>
+              <w:tc>
+                <w:tcPr/>
+                <w:p>
+                  <w:pPr>
+                    <w:pStyle w:val="Compact"/>
+                    <w:jc w:val="right"/>
+                    <w:jc w:val="center"/>
+                  </w:pPr>
+                  <w:r>
+                    <w:t xml:space="preserve">0.947</w:t>
+                  </w:r>
+                </w:p>
+              </w:tc>
+              <w:tc>
+                <w:tcPr/>
+                <w:p>
+                  <w:pPr>
+                    <w:pStyle w:val="Compact"/>
+                    <w:jc w:val="right"/>
+                    <w:jc w:val="center"/>
+                  </w:pPr>
+                  <w:r>
+                    <w:t xml:space="preserve">1</w:t>
+                  </w:r>
+                </w:p>
+              </w:tc>
+              <w:tc>
+                <w:tcPr/>
+                <w:p>
+                  <w:pPr>
+                    <w:pStyle w:val="Compact"/>
+                    <w:jc w:val="right"/>
+                    <w:jc w:val="center"/>
+                  </w:pPr>
+                  <w:r>
+                    <w:t xml:space="preserve">9.113</w:t>
                   </w:r>
                 </w:p>
               </w:tc>

</xml_diff>

<commit_message>
Correções das revisões (Standards e Spec): idade do clado dentro da classe de profundidade, arredondamentos, checagem de ordem das linhas, priors por classe
Co-Authored-By: Claude Opus 5.5 <noreply@anthropic.com>
</commit_message>
<xml_diff>
--- a/manuscript/supporting_information.docx
+++ b/manuscript/supporting_information.docx
@@ -1084,7 +1084,7 @@
         <w:pStyle w:val="FirstParagraph"/>
       </w:pPr>
       <w:r>
-        <w:t xml:space="preserve">In the R package PCPS, the axes of each taxa-shuffle permutation are rotated onto the observed ones by symmetric Procrustes before the test (PCPS::pcps.sig). We evaluated this variant for the first two axes at once in a second run of Layer A with the same design (without the PCC) and in Layer B (file procrustes_rates.csv of the code archive). At N = 100 and 200 with incidence data, and averaged over the Colless levels, the variant removed the inflation of GLM PCPS2 in S2σ (raw rates 0.002–0.009 in Layer A and 0.008–0.014 in Layer B under species sorting, against 0.096–0.294 and 0.055–0.127 without Procrustes). However, it was conservative even without nuisance structure (0.001–0.004 for GLM PCPS2 and 0.016–0.028 for GLM PCPS1 in S2 in Layer A, against nominal 0.05), and it reduced the power of GLM PCPS1, especially with low γ (in S3b, from 0.36 to 0.23 at N = 100 and from 0.44 to 0.27 at N = 200 in Layer A). For a single axis, the symmetric Procrustes is only a change of sign and scale and leaves the test unchanged. In the same run of Layer A, the RDA of PCPS axes 1–2 on the gradient, which needs no Procrustes, had rejection rates close to the nominal level in S2 (0.045–0.060 at N = 100 and 200), was conservative in S2σ (0.004–0.021), and lost little power with low γ (in S3b, 0.70, 0.74 and 0.78 at N = 100 and 0.91, 0.89 and 0.90 at N = 200 for low, median and Yule γ), whereas GLM PCPS1 fell from 0.78 to 0.36 at N = 100. Beta-binomial models with the structure of the main models, fitted to this run (R̂ ≤ 1.006, bulk and tail effective sample sizes ≥ 749 and ≥ 1,451, no divergent transitions; 95% posterior predictive coverage 0.97–0.99), gave the same picture: at N = 100 with incidence data and Yule imbalance, the posterior median power in S3b of the RDA PCPS was 0.65 with low γ against 0.76 in Yule trees, that of GLM PCPS1 0.34 against 0.74 and that of GLM PCPS1 with Procrustes 0.21 against 0.69, and the type I error of GLM PCPS2 with Procrustes was 0.002–0.003 in S2 and S2σ.</w:t>
+        <w:t xml:space="preserve">In the R package PCPS, the axes of each taxa-shuffle permutation are rotated onto the observed ones by symmetric Procrustes before the test (PCPS::pcps.sig). We evaluated this variant for the first two axes at once in a second run of Layer A with the same design (without the PCC) and in Layer B (file procrustes_rates.csv of the code archive). At N = 100 and 200 with incidence data, and averaged over the Colless levels, the variant removed the inflation of GLM PCPS2 in S2σ (raw rates 0.002–0.009 in Layer A and 0.008–0.014 in Layer B under species sorting, against 0.096–0.294 and 0.055–0.127 without Procrustes). However, it was conservative even without nuisance structure (0.001–0.004 for GLM PCPS2 and 0.016–0.028 for GLM PCPS1 in S2 in Layer A, against nominal 0.05), and it reduced the power of GLM PCPS1, especially with low γ (in S3b, from 0.36 to 0.23 at N = 100 and from 0.44 to 0.27 at N = 200 in Layer A). For a single axis, the symmetric Procrustes is only a change of sign and scale and leaves the test unchanged. In the same run of Layer A, the RDA of PCPS axes 1–2 on the gradient, which needs no Procrustes, had rejection rates close to the nominal level in S2 (0.045–0.060 at N = 100 and 200), was conservative in S2σ (0.004–0.021), and lost little power with low γ (in S3b, 0.70, 0.74 and 0.78 at N = 100 and 0.91, 0.89 and 0.90 at N = 200 for low, median and Yule γ), whereas GLM PCPS1 fell from 0.78 to 0.36 at N = 100. Beta-binomial models with the structure of the main models, fitted to this run (R̂ ≤ 1.006, bulk and tail effective sample sizes ≥ 748 and ≥ 1,451, no divergent transitions; 95% posterior predictive coverage 0.97–0.99), gave the same picture: at N = 100 with incidence data and Yule imbalance, the posterior median power in S3b of the RDA PCPS was 0.65 with low γ against 0.76 in Yule trees, that of GLM PCPS1 0.34 against 0.74 and that of GLM PCPS1 with Procrustes 0.21 against 0.69, and the type I error of GLM PCPS2 with Procrustes was 0.002–0.003 in S2 and S2σ.</w:t>
       </w:r>
     </w:p>
     <w:bookmarkEnd w:id="30"/>
@@ -1209,7 +1209,7 @@
         <w:pStyle w:val="FirstParagraph"/>
       </w:pPr>
       <w:r>
-        <w:t xml:space="preserve">The relative age of the stem node of the planted clade was recorded in every replicate. With a shift of 2, incidence data and N = 100, older clades were recovered more often by every method within each level of γ (evoPCA and phylofactorization, from 0.63–0.68 in the youngest to 0.79–0.82 in the oldest tertile of relative age; PCPS from 0.02 to 0.24 in Yule trees and from 0.22 to 0.62 with low γ), except the PCC, whose recovery did not increase with age at the median level of γ and decreased with low γ (from 0.15 to 0.04). In binomial GLMs with standardized relative age, γ level and their interaction, the effect of age was positive for every method (PCPS 1.63 ± 0.07 on the logit scale per standard deviation, PCC 0.97 ± 0.06, evoPCA 0.47 ± 0.04, phylofactorization 0.41 ± 0.04, at Yule γ) and stronger with low γ except for the PCC (files clade_age.csv and clade_age_glm.csv). Thus, the advantage of older clades is not only a consequence of γ, although both act together.</w:t>
+        <w:t xml:space="preserve">The relative age of the stem node of the planted clade was recorded in every replicate. Because relative age is tied to the depth class of the planted node (basal or recent), we compared tertiles of relative age within each depth class and level of γ, and fitted binomial GLMs of hit on standardized relative age, γ level, their interaction and depth class (shift 2, incidence data, N = 100; files clade_age.csv and clade_age_glm.csv). Within each depth class and level of γ, older clades were recovered more often by PCPS (e.g. basal clades, from 0.08 in the youngest to 0.34 in the oldest tertile in Yule trees and from 0.42 to 0.69 with low γ), evoPCA (from 0.59–0.75 to 0.71–0.85) and phylofactorization (from 0.60–0.77 to 0.69–0.82), whereas the PCC showed no consistent trend. In the GLMs, the effect of relative age at Yule γ was positive for every method after accounting for depth class (PCPS 1.55 ± 0.07 on the logit scale per standard deviation, PCC 0.96 ± 0.06, evoPCA 0.35 ± 0.05, phylofactorization 0.27 ± 0.05), and stronger with low γ except for the PCC (interaction −1.77 ± 0.11). Thus, the advantage of older clades is not only a consequence of γ or of the depth class, although the three act together.</w:t>
       </w:r>
     </w:p>
     <w:bookmarkEnd w:id="36"/>
@@ -1239,7 +1239,7 @@
         <w:t xml:space="preserve"> </w:t>
       </w:r>
       <w:r>
-        <w:t xml:space="preserve">in every model; file mean_structure.csv) measures the lack of fit of the fixed structure, which the beta-binomial precision φ absorbs. To check whether this lack of fit biases the predicted rates, we refitted every model with a binomial likelihood, the same fixed structure and a random intercept per condition, which captures any departure of a condition from the fixed structure (prior exponential(2) on its standard deviation; four chains of 2,000 iterations; script 35_mean_structure.R). The standard deviation of the condition effects was 0.16–0.28 on the logit scale. The predicted rates of these models agreed with those of the beta-binomial models (median absolute difference 0.002–0.014 across models, maximum 0.025–0.117, correlation 0.972–0.999). Convergence was acceptable but weaker than in the main models (R̂ ≤ 1.02, bulk effective sample size ≥ 377), and 13% of the transitions of the Layer A power model reached the maximum tree depth, so we used these models only as a check.</w:t>
+        <w:t xml:space="preserve">in every model; file mean_structure.csv) measures the lack of fit of the fixed structure, which the beta-binomial precision φ absorbs. To check whether this lack of fit biases the predicted rates, we refitted every model with a binomial likelihood, the same fixed structure and a random intercept per condition, which captures any departure of a condition from the fixed structure (prior exponential(2) on its standard deviation; four chains of 2,000 iterations; script 35_mean_structure.R). The standard deviation of the condition effects was 0.16–0.28 on the logit scale. The predicted rates of these models agreed with those of the beta-binomial models (median absolute difference 0.002–0.014 across models, maximum 0.025–0.117, correlation 0.972–0.999). Convergence was acceptable but weaker than in the main models (R̂ ≤ 1.021, bulk effective sample size ≥ 376), and 13% of the transitions of the Layer A power model reached the maximum tree depth, so we used these models only as a check.</w:t>
       </w:r>
     </w:p>
     <w:bookmarkEnd w:id="37"/>

</xml_diff>